<commit_message>
Update the TRIPOD+AI checklist to the final version with page/line references
</commit_message>
<xml_diff>
--- a/docs/TRIPOD_AI_checklist.docx
+++ b/docs/TRIPOD_AI_checklist.docx
@@ -27,7 +27,7 @@
           <w:sz w:val="18"/>
           <w:szCs w:val="18"/>
         </w:rPr>
-        <w:t xml:space="preserve">Completed checklist for this study, following Collins et al. (2024, BMJ 385:e078378). This is a development study with internal validation only (repeated stratified cross-validation, single dataset); evaluation-only items are marked N/A with justification (grey). Use the official item wording from Collins et al. (2024) in the submitted version; the wording here is abbreviated. Add page/line references in the final column once the manuscript is paginated with continuous line numbers.</w:t>
+        <w:t xml:space="preserve">Completed checklist for this study, following Collins et al. (2024, BMJ 385:e078378). This is a development study with internal validation only (repeated stratified cross-validation, single dataset); evaluation-only items are marked N/A with justification (grey). Use the official item wording from Collins et al. (2024) in the submitted version; the wording here is abbreviated. Page and line references correspond to the paginated manuscript with continuous line numbers (ML_DLD_ManusAugust2026_newVersion290826).</w:t>
       </w:r>
     </w:p>
     <w:tbl>
@@ -334,6 +334,9 @@
               </w:rPr>
               <w:t xml:space="preserve"/>
             </w:r>
+            <w:r>
+              <w:t xml:space="preserve">p. 1, lines 1–2; p. 3, lines 44–49</w:t>
+            </w:r>
           </w:p>
         </w:tc>
       </w:tr>
@@ -462,6 +465,9 @@
               </w:rPr>
               <w:t xml:space="preserve"/>
             </w:r>
+            <w:r>
+              <w:t xml:space="preserve">p. 3, lines 42–65</w:t>
+            </w:r>
           </w:p>
         </w:tc>
       </w:tr>
@@ -622,6 +628,9 @@
               </w:rPr>
               <w:t xml:space="preserve"/>
             </w:r>
+            <w:r>
+              <w:t xml:space="preserve">p. 5–7, lines 69–124</w:t>
+            </w:r>
           </w:p>
         </w:tc>
       </w:tr>
@@ -750,6 +759,9 @@
               </w:rPr>
               <w:t xml:space="preserve"/>
             </w:r>
+            <w:r>
+              <w:t xml:space="preserve">p. 5, lines 79–90; p. 26, lines 546–563</w:t>
+            </w:r>
           </w:p>
         </w:tc>
       </w:tr>
@@ -878,6 +890,9 @@
               </w:rPr>
               <w:t xml:space="preserve"/>
             </w:r>
+            <w:r>
+              <w:t xml:space="preserve">p. 5–6, lines 90–96; p. 27, lines 570–574</w:t>
+            </w:r>
           </w:p>
         </w:tc>
       </w:tr>
@@ -1006,6 +1021,9 @@
               </w:rPr>
               <w:t xml:space="preserve"/>
             </w:r>
+            <w:r>
+              <w:t xml:space="preserve">p. 8, lines 136–145</w:t>
+            </w:r>
           </w:p>
         </w:tc>
       </w:tr>
@@ -1166,6 +1184,9 @@
               </w:rPr>
               <w:t xml:space="preserve"/>
             </w:r>
+            <w:r>
+              <w:t xml:space="preserve">p. 8, lines 147–152; p. 13, lines 257–262</w:t>
+            </w:r>
           </w:p>
         </w:tc>
       </w:tr>
@@ -1294,6 +1315,9 @@
               </w:rPr>
               <w:t xml:space="preserve"/>
             </w:r>
+            <w:r>
+              <w:t xml:space="preserve">p. 8, lines 156–157</w:t>
+            </w:r>
           </w:p>
         </w:tc>
       </w:tr>
@@ -1422,6 +1446,9 @@
               </w:rPr>
               <w:t xml:space="preserve"/>
             </w:r>
+            <w:r>
+              <w:t xml:space="preserve">p. 8, lines 152–153; p. 18, line 350</w:t>
+            </w:r>
           </w:p>
         </w:tc>
       </w:tr>
@@ -1550,6 +1577,9 @@
               </w:rPr>
               <w:t xml:space="preserve"/>
             </w:r>
+            <w:r>
+              <w:t xml:space="preserve">p. 9, lines 160–177; p. 10, lines 186–194</w:t>
+            </w:r>
           </w:p>
         </w:tc>
       </w:tr>
@@ -1678,6 +1708,9 @@
               </w:rPr>
               <w:t xml:space="preserve"/>
             </w:r>
+            <w:r>
+              <w:t xml:space="preserve">—</w:t>
+            </w:r>
           </w:p>
         </w:tc>
       </w:tr>
@@ -1806,6 +1839,9 @@
               </w:rPr>
               <w:t xml:space="preserve"/>
             </w:r>
+            <w:r>
+              <w:t xml:space="preserve">p. 12–13, lines 248–255</w:t>
+            </w:r>
           </w:p>
         </w:tc>
       </w:tr>
@@ -1934,6 +1970,9 @@
               </w:rPr>
               <w:t xml:space="preserve"/>
             </w:r>
+            <w:r>
+              <w:t xml:space="preserve">p. 10, lines 186–204</w:t>
+            </w:r>
           </w:p>
         </w:tc>
       </w:tr>
@@ -2062,6 +2101,9 @@
               </w:rPr>
               <w:t xml:space="preserve"/>
             </w:r>
+            <w:r>
+              <w:t xml:space="preserve">p. 10, lines 187–190</w:t>
+            </w:r>
           </w:p>
         </w:tc>
       </w:tr>
@@ -2190,6 +2232,9 @@
               </w:rPr>
               <w:t xml:space="preserve"/>
             </w:r>
+            <w:r>
+              <w:t xml:space="preserve">p. 10, lines 199–204</w:t>
+            </w:r>
           </w:p>
         </w:tc>
       </w:tr>
@@ -2318,6 +2363,9 @@
               </w:rPr>
               <w:t xml:space="preserve"/>
             </w:r>
+            <w:r>
+              <w:t xml:space="preserve">p. 11–12, lines 206–245</w:t>
+            </w:r>
           </w:p>
         </w:tc>
       </w:tr>
@@ -2446,6 +2494,9 @@
               </w:rPr>
               <w:t xml:space="preserve"/>
             </w:r>
+            <w:r>
+              <w:t xml:space="preserve">p. 11, lines 207–212</w:t>
+            </w:r>
           </w:p>
         </w:tc>
       </w:tr>
@@ -2574,6 +2625,9 @@
               </w:rPr>
               <w:t xml:space="preserve"/>
             </w:r>
+            <w:r>
+              <w:t xml:space="preserve">p. 11, lines 208–211</w:t>
+            </w:r>
           </w:p>
         </w:tc>
       </w:tr>
@@ -2734,6 +2788,9 @@
               </w:rPr>
               <w:t xml:space="preserve"/>
             </w:r>
+            <w:r>
+              <w:t xml:space="preserve">p. 13–14, lines 256–271</w:t>
+            </w:r>
           </w:p>
         </w:tc>
       </w:tr>
@@ -2862,6 +2919,9 @@
               </w:rPr>
               <w:t xml:space="preserve"/>
             </w:r>
+            <w:r>
+              <w:t xml:space="preserve">p. 12–13, lines 228–235, 248–255; p. 17–18, lines 351–354</w:t>
+            </w:r>
           </w:p>
         </w:tc>
       </w:tr>
@@ -2990,6 +3050,9 @@
               </w:rPr>
               <w:t xml:space="preserve"/>
             </w:r>
+            <w:r>
+              <w:t xml:space="preserve">p. 14, lines 273–279; p. 15, lines 292–299</w:t>
+            </w:r>
           </w:p>
         </w:tc>
       </w:tr>
@@ -3118,6 +3181,9 @@
               </w:rPr>
               <w:t xml:space="preserve"/>
             </w:r>
+            <w:r>
+              <w:t xml:space="preserve">p. 14, lines 276–279</w:t>
+            </w:r>
           </w:p>
         </w:tc>
       </w:tr>
@@ -3246,6 +3312,9 @@
               </w:rPr>
               <w:t xml:space="preserve"/>
             </w:r>
+            <w:r>
+              <w:t xml:space="preserve">p. 14, lines 280–291</w:t>
+            </w:r>
           </w:p>
         </w:tc>
       </w:tr>
@@ -3374,6 +3443,9 @@
               </w:rPr>
               <w:t xml:space="preserve"/>
             </w:r>
+            <w:r>
+              <w:t xml:space="preserve">—</w:t>
+            </w:r>
           </w:p>
         </w:tc>
       </w:tr>
@@ -3501,6 +3573,9 @@
                 <w:szCs w:val="18"/>
               </w:rPr>
               <w:t xml:space="preserve"/>
+            </w:r>
+            <w:r>
+              <w:t xml:space="preserve">p. 15, lines 297–310; Figures 2–3 (pp. 40–41)</w:t>
             </w:r>
           </w:p>
         </w:tc>
@@ -3634,6 +3709,9 @@
               </w:rPr>
               <w:t xml:space="preserve"/>
             </w:r>
+            <w:r>
+              <w:t xml:space="preserve">—</w:t>
+            </w:r>
           </w:p>
         </w:tc>
       </w:tr>
@@ -3766,6 +3844,9 @@
               </w:rPr>
               <w:t xml:space="preserve"/>
             </w:r>
+            <w:r>
+              <w:t xml:space="preserve">p. 15, lines 304–310</w:t>
+            </w:r>
           </w:p>
         </w:tc>
       </w:tr>
@@ -3926,6 +4007,9 @@
               </w:rPr>
               <w:t xml:space="preserve"/>
             </w:r>
+            <w:r>
+              <w:t xml:space="preserve">p. 15, lines 300–303</w:t>
+            </w:r>
           </w:p>
         </w:tc>
       </w:tr>
@@ -4054,6 +4138,9 @@
               </w:rPr>
               <w:t xml:space="preserve"/>
             </w:r>
+            <w:r>
+              <w:t xml:space="preserve">p. 15–16, lines 311–316; p. 27, lines 568–570</w:t>
+            </w:r>
           </w:p>
         </w:tc>
       </w:tr>
@@ -4181,6 +4268,9 @@
                 <w:szCs w:val="18"/>
               </w:rPr>
               <w:t xml:space="preserve"/>
+            </w:r>
+            <w:r>
+              <w:t xml:space="preserve">p. 15, lines 304–308; p. 28, lines 592–594</w:t>
             </w:r>
           </w:p>
         </w:tc>
@@ -4314,6 +4404,9 @@
               </w:rPr>
               <w:t xml:space="preserve"/>
             </w:r>
+            <w:r>
+              <w:t xml:space="preserve">—</w:t>
+            </w:r>
           </w:p>
         </w:tc>
       </w:tr>
@@ -4442,6 +4535,9 @@
               </w:rPr>
               <w:t xml:space="preserve"/>
             </w:r>
+            <w:r>
+              <w:t xml:space="preserve">p. 8–9, lines 153–159</w:t>
+            </w:r>
           </w:p>
         </w:tc>
       </w:tr>
@@ -4602,6 +4698,9 @@
               </w:rPr>
               <w:t xml:space="preserve"/>
             </w:r>
+            <w:r>
+              <w:t xml:space="preserve">p. 29, lines 612–614</w:t>
+            </w:r>
           </w:p>
         </w:tc>
       </w:tr>
@@ -4730,6 +4829,9 @@
               </w:rPr>
               <w:t xml:space="preserve"/>
             </w:r>
+            <w:r>
+              <w:t xml:space="preserve">Submission portal (ASHA policy)</w:t>
+            </w:r>
           </w:p>
         </w:tc>
       </w:tr>
@@ -4858,6 +4960,9 @@
               </w:rPr>
               <w:t xml:space="preserve"/>
             </w:r>
+            <w:r>
+              <w:t xml:space="preserve">p. 17, lines 338–339</w:t>
+            </w:r>
           </w:p>
         </w:tc>
       </w:tr>
@@ -4986,6 +5091,9 @@
               </w:rPr>
               <w:t xml:space="preserve"/>
             </w:r>
+            <w:r>
+              <w:t xml:space="preserve">p. 17, lines 338–339</w:t>
+            </w:r>
           </w:p>
         </w:tc>
       </w:tr>
@@ -5114,6 +5222,9 @@
               </w:rPr>
               <w:t xml:space="preserve"/>
             </w:r>
+            <w:r>
+              <w:t xml:space="preserve">p. 29, lines 616–619</w:t>
+            </w:r>
           </w:p>
         </w:tc>
       </w:tr>
@@ -5242,6 +5353,9 @@
               </w:rPr>
               <w:t xml:space="preserve"/>
             </w:r>
+            <w:r>
+              <w:t xml:space="preserve">p. 29, lines 619–621</w:t>
+            </w:r>
           </w:p>
         </w:tc>
       </w:tr>
@@ -5370,6 +5484,9 @@
               </w:rPr>
               <w:t xml:space="preserve"/>
             </w:r>
+            <w:r>
+              <w:t xml:space="preserve">p. 29, lines 606–610</w:t>
+            </w:r>
           </w:p>
         </w:tc>
       </w:tr>
@@ -5530,6 +5647,9 @@
               </w:rPr>
               <w:t xml:space="preserve"/>
             </w:r>
+            <w:r>
+              <w:t xml:space="preserve">p. 9, lines 172–177; p. 17, lines 342–343; S1</w:t>
+            </w:r>
           </w:p>
         </w:tc>
       </w:tr>
@@ -5657,6 +5777,9 @@
                 <w:szCs w:val="18"/>
               </w:rPr>
               <w:t xml:space="preserve"/>
+            </w:r>
+            <w:r>
+              <w:t xml:space="preserve">p. 17–18, lines 341–354; Tables 1 and 3</w:t>
             </w:r>
           </w:p>
         </w:tc>
@@ -5790,6 +5913,9 @@
               </w:rPr>
               <w:t xml:space="preserve"/>
             </w:r>
+            <w:r>
+              <w:t xml:space="preserve">—</w:t>
+            </w:r>
           </w:p>
         </w:tc>
       </w:tr>
@@ -5918,6 +6044,9 @@
               </w:rPr>
               <w:t xml:space="preserve"/>
             </w:r>
+            <w:r>
+              <w:t xml:space="preserve">p. 14, line 274; p. 17, lines 343–345</w:t>
+            </w:r>
           </w:p>
         </w:tc>
       </w:tr>
@@ -6046,6 +6175,9 @@
               </w:rPr>
               <w:t xml:space="preserve"/>
             </w:r>
+            <w:r>
+              <w:t xml:space="preserve">p. 19, lines 397–402; repository</w:t>
+            </w:r>
           </w:p>
         </w:tc>
       </w:tr>
@@ -6174,6 +6306,9 @@
               </w:rPr>
               <w:t xml:space="preserve"/>
             </w:r>
+            <w:r>
+              <w:t xml:space="preserve">p. 18, lines 370–377; Table 4</w:t>
+            </w:r>
           </w:p>
         </w:tc>
       </w:tr>
@@ -6301,6 +6436,9 @@
                 <w:szCs w:val="18"/>
               </w:rPr>
               <w:t xml:space="preserve"/>
+            </w:r>
+            <w:r>
+              <w:t xml:space="preserve">—</w:t>
             </w:r>
           </w:p>
         </w:tc>
@@ -6434,6 +6572,9 @@
               </w:rPr>
               <w:t xml:space="preserve"/>
             </w:r>
+            <w:r>
+              <w:t xml:space="preserve">—</w:t>
+            </w:r>
           </w:p>
         </w:tc>
       </w:tr>
@@ -6594,6 +6735,9 @@
               </w:rPr>
               <w:t xml:space="preserve"/>
             </w:r>
+            <w:r>
+              <w:t xml:space="preserve">p. 23–26, lines 468–545</w:t>
+            </w:r>
           </w:p>
         </w:tc>
       </w:tr>
@@ -6722,6 +6866,9 @@
               </w:rPr>
               <w:t xml:space="preserve"/>
             </w:r>
+            <w:r>
+              <w:t xml:space="preserve">p. 27–28, lines 566–594</w:t>
+            </w:r>
           </w:p>
         </w:tc>
       </w:tr>
@@ -6850,6 +6997,9 @@
               </w:rPr>
               <w:t xml:space="preserve"/>
             </w:r>
+            <w:r>
+              <w:t xml:space="preserve">p. 26, lines 552–556</w:t>
+            </w:r>
           </w:p>
         </w:tc>
       </w:tr>
@@ -6977,6 +7127,9 @@
                 <w:szCs w:val="18"/>
               </w:rPr>
               <w:t xml:space="preserve"/>
+            </w:r>
+            <w:r>
+              <w:t xml:space="preserve">p. 26–27, lines 556–561</w:t>
             </w:r>
           </w:p>
         </w:tc>

</xml_diff>

<commit_message>
TRIPOD+AI checklist: official Collins item wording, plus item 27c
</commit_message>
<xml_diff>
--- a/docs/TRIPOD_AI_checklist.docx
+++ b/docs/TRIPOD_AI_checklist.docx
@@ -27,7 +27,7 @@
           <w:sz w:val="18"/>
           <w:szCs w:val="18"/>
         </w:rPr>
-        <w:t xml:space="preserve">Completed checklist for this study, following Collins et al. (2024, BMJ 385:e078378). This is a development study with internal validation only (repeated stratified cross-validation, single dataset); evaluation-only items are marked N/A with justification (grey). Use the official item wording from Collins et al. (2024) in the submitted version; the wording here is abbreviated. Page and line references correspond to the paginated manuscript with continuous line numbers (ML_DLD_ManusAugust2026_newVersion290826).</w:t>
+        <w:t xml:space="preserve">Completed checklist for this study, following Collins et al. (2024, BMJ 385:e078378). This is a development study with internal validation only (repeated stratified cross-validation, single dataset); evaluation-only items are marked N/A with justification (grey). Page and line references correspond to the paginated manuscript with continuous line numbers (ML_DLD_ManusAugust2026_newVersion290826).</w:t>
       </w:r>
     </w:p>
     <w:tbl>
@@ -270,7 +270,7 @@
                 <w:sz w:val="18"/>
                 <w:szCs w:val="18"/>
               </w:rPr>
-              <w:t xml:space="preserve">Title — identify as developing a multivariable prediction/classification model, target population, outcome</w:t>
+              <w:t xml:space="preserve">Identify the study as developing or evaluating the performance of a multivariable prediction model, the target population, and the outcome to be predicted</w:t>
             </w:r>
           </w:p>
         </w:tc>
@@ -401,7 +401,7 @@
                 <w:sz w:val="18"/>
                 <w:szCs w:val="18"/>
               </w:rPr>
-              <w:t xml:space="preserve">Abstract — structured summary per TRIPOD+AI for Abstracts</w:t>
+              <w:t xml:space="preserve">See TRIPOD+AI for Abstracts checklist</w:t>
             </w:r>
           </w:p>
         </w:tc>
@@ -564,7 +564,7 @@
                 <w:sz w:val="18"/>
                 <w:szCs w:val="18"/>
               </w:rPr>
-              <w:t xml:space="preserve">Background; state the model is diagnostic; rationale; existing models</w:t>
+              <w:t xml:space="preserve">Explain the healthcare context (including whether diagnostic or prognostic) and rationale for developing or evaluating the prediction model, including references to existing models</w:t>
             </w:r>
           </w:p>
         </w:tc>
@@ -695,7 +695,7 @@
                 <w:sz w:val="18"/>
                 <w:szCs w:val="18"/>
               </w:rPr>
-              <w:t xml:space="preserve">Target population, intended use in the care pathway, intended users</w:t>
+              <w:t xml:space="preserve">Describe the target population and the intended purpose of the prediction model in the context of the care pathway, including its intended users (e.g., healthcare professionals, patients, public)</w:t>
             </w:r>
           </w:p>
         </w:tc>
@@ -826,7 +826,7 @@
                 <w:sz w:val="18"/>
                 <w:szCs w:val="18"/>
               </w:rPr>
-              <w:t xml:space="preserve">Known health inequalities between sociodemographic groups</w:t>
+              <w:t xml:space="preserve">Describe any known health inequalities between sociodemographic groups</w:t>
             </w:r>
           </w:p>
         </w:tc>
@@ -957,7 +957,7 @@
                 <w:sz w:val="18"/>
                 <w:szCs w:val="18"/>
               </w:rPr>
-              <w:t xml:space="preserve">Objectives; state development vs validation</w:t>
+              <w:t xml:space="preserve">Specify the study objectives, including whether the study describes the development or validation of a prediction model (or both)</w:t>
             </w:r>
           </w:p>
         </w:tc>
@@ -1120,7 +1120,7 @@
                 <w:sz w:val="18"/>
                 <w:szCs w:val="18"/>
               </w:rPr>
-              <w:t xml:space="preserve">Data sources and rationale; representativeness</w:t>
+              <w:t xml:space="preserve">Describe the sources of data separately for the development and evaluation datasets (e.g., randomised trial, cohort, routine care or registry data), the rationale for using these data, and representativeness of the data</w:t>
             </w:r>
           </w:p>
         </w:tc>
@@ -1251,7 +1251,7 @@
                 <w:sz w:val="18"/>
                 <w:szCs w:val="18"/>
               </w:rPr>
-              <w:t xml:space="preserve">Accrual dates</w:t>
+              <w:t xml:space="preserve">Specify the dates of the collected participant data, including start and end of participant accrual; and, if applicable, end of follow-up</w:t>
             </w:r>
           </w:p>
         </w:tc>
@@ -1382,7 +1382,7 @@
                 <w:sz w:val="18"/>
                 <w:szCs w:val="18"/>
               </w:rPr>
-              <w:t xml:space="preserve">Setting; number/location of centres</w:t>
+              <w:t xml:space="preserve">Specify key elements of the study setting (e.g., primary care, secondary care, general population) including the number and location of centres</w:t>
             </w:r>
           </w:p>
         </w:tc>
@@ -1513,7 +1513,7 @@
                 <w:sz w:val="18"/>
                 <w:szCs w:val="18"/>
               </w:rPr>
-              <w:t xml:space="preserve">Eligibility criteria</w:t>
+              <w:t xml:space="preserve">Describe the eligibility criteria for study participants</w:t>
             </w:r>
           </w:p>
         </w:tc>
@@ -1644,7 +1644,7 @@
                 <w:sz w:val="18"/>
                 <w:szCs w:val="18"/>
               </w:rPr>
-              <w:t xml:space="preserve">Treatments received and handling (if relevant)</w:t>
+              <w:t xml:space="preserve">Give details of any treatments received, and how they were handled during model development or evaluation, if relevant</w:t>
             </w:r>
           </w:p>
         </w:tc>
@@ -1775,7 +1775,7 @@
                 <w:sz w:val="18"/>
                 <w:szCs w:val="18"/>
               </w:rPr>
-              <w:t xml:space="preserve">Data preparation; quality checks; applied equally across groups</w:t>
+              <w:t xml:space="preserve">Describe any data pre-processing and quality checking, including whether this was similar across relevant sociodemographic groups</w:t>
             </w:r>
           </w:p>
         </w:tc>
@@ -1906,7 +1906,7 @@
                 <w:sz w:val="18"/>
                 <w:szCs w:val="18"/>
               </w:rPr>
-              <w:t xml:space="preserve">Outcome definition; how/when assessed; consistency across groups</w:t>
+              <w:t xml:space="preserve">Clearly define the outcome that is being predicted and the time horizon, including how and when assessed, the rationale for choosing this outcome, and whether the method of outcome assessment is consistent across sociodemographic groups</w:t>
             </w:r>
           </w:p>
         </w:tc>
@@ -2037,7 +2037,7 @@
                 <w:sz w:val="18"/>
                 <w:szCs w:val="18"/>
               </w:rPr>
-              <w:t xml:space="preserve">If subjective outcome, assessor qualifications</w:t>
+              <w:t xml:space="preserve">If outcome assessment requires subjective interpretation, describe the qualifications and demographic characteristics of the outcome assessors</w:t>
             </w:r>
           </w:p>
         </w:tc>
@@ -2168,7 +2168,7 @@
                 <w:sz w:val="18"/>
                 <w:szCs w:val="18"/>
               </w:rPr>
-              <w:t xml:space="preserve">Blinding of outcome assessment</w:t>
+              <w:t xml:space="preserve">Report any actions to blind assessment of the outcome to be predicted</w:t>
             </w:r>
           </w:p>
         </w:tc>
@@ -2299,7 +2299,7 @@
                 <w:sz w:val="18"/>
                 <w:szCs w:val="18"/>
               </w:rPr>
-              <w:t xml:space="preserve">Initial predictors and any pre-selection before modelling</w:t>
+              <w:t xml:space="preserve">Describe the choice of initial predictors (e.g., literature, previous models, all available predictors) and any pre-selection of predictors before model building</w:t>
             </w:r>
           </w:p>
         </w:tc>
@@ -2430,7 +2430,7 @@
                 <w:sz w:val="18"/>
                 <w:szCs w:val="18"/>
               </w:rPr>
-              <w:t xml:space="preserve">Define predictors; how/when measured; blinding</w:t>
+              <w:t xml:space="preserve">Clearly define all predictors, including how and when they were measured (and any actions to blind assessment of predictors for the outcome and other predictors)</w:t>
             </w:r>
           </w:p>
         </w:tc>
@@ -2561,7 +2561,7 @@
                 <w:sz w:val="18"/>
                 <w:szCs w:val="18"/>
               </w:rPr>
-              <w:t xml:space="preserve">If subjective predictors, assessor qualifications</w:t>
+              <w:t xml:space="preserve">If predictor measurement requires subjective interpretation, describe the qualifications and demographic characteristics of the predictor assessors</w:t>
             </w:r>
           </w:p>
         </w:tc>
@@ -2724,7 +2724,7 @@
                 <w:sz w:val="18"/>
                 <w:szCs w:val="18"/>
               </w:rPr>
-              <w:t xml:space="preserve">Sample size and justification of sufficiency</w:t>
+              <w:t xml:space="preserve">Explain how the study size was arrived at (separately for development and evaluation), and justify that the study size was sufficient to answer the research question. Include details of any sample size calculation</w:t>
             </w:r>
           </w:p>
         </w:tc>
@@ -2855,7 +2855,7 @@
                 <w:sz w:val="18"/>
                 <w:szCs w:val="18"/>
               </w:rPr>
-              <w:t xml:space="preserve">Missing-data handling and reasons for omissions</w:t>
+              <w:t xml:space="preserve">Describe how missing data were handled. Provide reasons for omitting any data</w:t>
             </w:r>
           </w:p>
         </w:tc>
@@ -2986,7 +2986,7 @@
                 <w:sz w:val="18"/>
                 <w:szCs w:val="18"/>
               </w:rPr>
-              <w:t xml:space="preserve">How data were used/partitioned</w:t>
+              <w:t xml:space="preserve">Describe how the data were used (e.g., for development and evaluation of model performance) in the analysis, including whether the data were partitioned, considering any sample size requirements</w:t>
             </w:r>
           </w:p>
         </w:tc>
@@ -3117,7 +3117,7 @@
                 <w:sz w:val="18"/>
                 <w:szCs w:val="18"/>
               </w:rPr>
-              <w:t xml:space="preserve">Predictor handling (rescaling/standardization)</w:t>
+              <w:t xml:space="preserve">Depending on the type of model, describe how predictors were handled in the analyses (functional form, rescaling, transformation, or any standardisation).</w:t>
             </w:r>
           </w:p>
         </w:tc>
@@ -3248,7 +3248,7 @@
                 <w:sz w:val="18"/>
                 <w:szCs w:val="18"/>
               </w:rPr>
-              <w:t xml:space="preserve">Model type, rationale, ALL model-building steps incl. tuning, internal-validation method</w:t>
+              <w:t xml:space="preserve">Specify the type of model, rationale, all model-building steps, including any hyperparameter tuning, and method for internal validation</w:t>
             </w:r>
           </w:p>
         </w:tc>
@@ -3379,7 +3379,7 @@
                 <w:sz w:val="18"/>
                 <w:szCs w:val="18"/>
               </w:rPr>
-              <w:t xml:space="preserve">Heterogeneity across clusters (centres/regions)</w:t>
+              <w:t xml:space="preserve">Describe if and how any heterogeneity in estimates of model parameter values and model performance was handled and quantified across clusters (e.g., hospitals, countries). See TRIPOD-Cluster for additional considerations</w:t>
             </w:r>
           </w:p>
         </w:tc>
@@ -3510,7 +3510,7 @@
                 <w:sz w:val="18"/>
                 <w:szCs w:val="18"/>
               </w:rPr>
-              <w:t xml:space="preserve">Discrimination, calibration, clinical utility; model comparison</w:t>
+              <w:t xml:space="preserve">Specify all measures and plots used (and their rationale) to evaluate model performance (e.g., discrimination, calibration, clinical utility) and, if relevant, to compare multiple models</w:t>
             </w:r>
           </w:p>
         </w:tc>
@@ -3641,7 +3641,7 @@
                 <w:sz w:val="18"/>
                 <w:szCs w:val="18"/>
               </w:rPr>
-              <w:t xml:space="preserve">Model updating from evaluation</w:t>
+              <w:t xml:space="preserve">Describe any model updating (e.g., recalibration) arising from the model evaluation, either overall or for particular sociodemographic groups or settings</w:t>
             </w:r>
           </w:p>
         </w:tc>
@@ -3776,7 +3776,7 @@
                 <w:sz w:val="18"/>
                 <w:szCs w:val="18"/>
               </w:rPr>
-              <w:t xml:space="preserve">How predictions calculated for evaluation</w:t>
+              <w:t xml:space="preserve">For model evaluation, describe how the model predictions were calculated (e.g., formula, code, object, application programming interface)</w:t>
             </w:r>
           </w:p>
         </w:tc>
@@ -3943,7 +3943,7 @@
                 <w:sz w:val="18"/>
                 <w:szCs w:val="18"/>
               </w:rPr>
-              <w:t xml:space="preserve">Class-imbalance handling and effect on calibration</w:t>
+              <w:t xml:space="preserve">If class imbalance methods were used, state why and how this was done, and any subsequent methods to recalibrate the model or the model predictions</w:t>
             </w:r>
           </w:p>
         </w:tc>
@@ -4074,7 +4074,7 @@
                 <w:sz w:val="18"/>
                 <w:szCs w:val="18"/>
               </w:rPr>
-              <w:t xml:space="preserve">Fairness approaches and rationale</w:t>
+              <w:t xml:space="preserve">Describe any approaches that were used to address model fairness and their rationale</w:t>
             </w:r>
           </w:p>
         </w:tc>
@@ -4205,7 +4205,7 @@
                 <w:sz w:val="18"/>
                 <w:szCs w:val="18"/>
               </w:rPr>
-              <w:t xml:space="preserve">Model output (probabilities vs class) and threshold rationale</w:t>
+              <w:t xml:space="preserve">Specify the output of the prediction model (e.g., probabilities, classification). Provide details and rationale for any classification and how the thresholds were identified</w:t>
             </w:r>
           </w:p>
         </w:tc>
@@ -4336,7 +4336,7 @@
                 <w:sz w:val="18"/>
                 <w:szCs w:val="18"/>
               </w:rPr>
-              <w:t xml:space="preserve">Differences between development and evaluation data</w:t>
+              <w:t xml:space="preserve">Identify any differences between the development and evaluation data in healthcare setting, eligibility criteria, outcome, and predictors</w:t>
             </w:r>
           </w:p>
         </w:tc>
@@ -4471,7 +4471,7 @@
                 <w:sz w:val="18"/>
                 <w:szCs w:val="18"/>
               </w:rPr>
-              <w:t xml:space="preserve">Ethical approval and consent</w:t>
+              <w:t xml:space="preserve">Name the institutional research board or ethics committee that approved the study and describe the participant-informed consent or the ethics committee waiver of informed consent</w:t>
             </w:r>
           </w:p>
         </w:tc>
@@ -4634,7 +4634,7 @@
                 <w:sz w:val="18"/>
                 <w:szCs w:val="18"/>
               </w:rPr>
-              <w:t xml:space="preserve">Funding and role of funders</w:t>
+              <w:t xml:space="preserve">Give the source of funding and the role of the funders for the present study</w:t>
             </w:r>
           </w:p>
         </w:tc>
@@ -4765,7 +4765,7 @@
                 <w:sz w:val="18"/>
                 <w:szCs w:val="18"/>
               </w:rPr>
-              <w:t xml:space="preserve">Conflicts of interest</w:t>
+              <w:t xml:space="preserve">Declare any conflicts of interest and financial disclosures for all authors</w:t>
             </w:r>
           </w:p>
         </w:tc>
@@ -4896,7 +4896,7 @@
                 <w:sz w:val="18"/>
                 <w:szCs w:val="18"/>
               </w:rPr>
-              <w:t xml:space="preserve">Protocol availability, or state none</w:t>
+              <w:t xml:space="preserve">Indicate where the study protocol can be accessed or state that a protocol was not prepared</w:t>
             </w:r>
           </w:p>
         </w:tc>
@@ -5027,7 +5027,7 @@
                 <w:sz w:val="18"/>
                 <w:szCs w:val="18"/>
               </w:rPr>
-              <w:t xml:space="preserve">Registration, or state not registered</w:t>
+              <w:t xml:space="preserve">Provide registration information for the study, including register name and registration number, or state that the study was not registered</w:t>
             </w:r>
           </w:p>
         </w:tc>
@@ -5158,7 +5158,7 @@
                 <w:sz w:val="18"/>
                 <w:szCs w:val="18"/>
               </w:rPr>
-              <w:t xml:space="preserve">Study-data availability</w:t>
+              <w:t xml:space="preserve">Provide details of the availability of the study data</w:t>
             </w:r>
           </w:p>
         </w:tc>
@@ -5289,7 +5289,7 @@
                 <w:sz w:val="18"/>
                 <w:szCs w:val="18"/>
               </w:rPr>
-              <w:t xml:space="preserve">Analytical-code availability</w:t>
+              <w:t xml:space="preserve">Provide details of the availability of the analytical code</w:t>
             </w:r>
           </w:p>
         </w:tc>
@@ -5420,7 +5420,7 @@
                 <w:sz w:val="18"/>
                 <w:szCs w:val="18"/>
               </w:rPr>
-              <w:t xml:space="preserve">Patient/public involvement, or state none</w:t>
+              <w:t xml:space="preserve">Provide details of any patient and public involvement during the design, conduct, reporting, interpretation, or dissemination of the study or state no involvement.</w:t>
             </w:r>
           </w:p>
         </w:tc>
@@ -5583,7 +5583,7 @@
                 <w:sz w:val="18"/>
                 <w:szCs w:val="18"/>
               </w:rPr>
-              <w:t xml:space="preserve">Participant flow; numbers with/without outcome; diagram</w:t>
+              <w:t xml:space="preserve">Describe the flow of participants through the study, including the number of participants with and without the outcome and, if applicable, a summary of the follow-up time. A diagram may be helpful.</w:t>
             </w:r>
           </w:p>
         </w:tc>
@@ -5714,7 +5714,7 @@
                 <w:sz w:val="18"/>
                 <w:szCs w:val="18"/>
               </w:rPr>
-              <w:t xml:space="preserve">Characteristics; key predictors; demographics; missing-data amounts; group differences</w:t>
+              <w:t xml:space="preserve">Report the characteristics overall and, where applicable, for each data source or setting, including the key dates, key predictors (including demographics), treatments received, sample size, number of outcome events, follow-up time, and amount of missing data. A table may be helpful. Report any differences across key demographic groups.</w:t>
             </w:r>
           </w:p>
         </w:tc>
@@ -5845,7 +5845,7 @@
                 <w:sz w:val="18"/>
                 <w:szCs w:val="18"/>
               </w:rPr>
-              <w:t xml:space="preserve">Compare evaluation vs development predictor distributions</w:t>
+              <w:t xml:space="preserve">For model evaluation, show a comparison with the development data of the distribution of important predictors (demographics, predictors, and outcome).</w:t>
             </w:r>
           </w:p>
         </w:tc>
@@ -5980,7 +5980,7 @@
                 <w:sz w:val="18"/>
                 <w:szCs w:val="18"/>
               </w:rPr>
-              <w:t xml:space="preserve">Participants and outcome events per analysis</w:t>
+              <w:t xml:space="preserve">Specify the number of participants and outcome events in each analysis (e.g., for model development, hyperparameter tuning, model evaluation)</w:t>
             </w:r>
           </w:p>
         </w:tc>
@@ -6111,7 +6111,7 @@
                 <w:sz w:val="18"/>
                 <w:szCs w:val="18"/>
               </w:rPr>
-              <w:t xml:space="preserve">Full model for predictions in new individuals</w:t>
+              <w:t xml:space="preserve">Provide details of the full prediction model (e.g., formula, code, object, application programming interface) to allow predictions in new individuals and to enable third-party evaluation and implementation, including any restrictions to access or re-use (e.g., freely available, proprietary)</w:t>
             </w:r>
           </w:p>
         </w:tc>
@@ -6242,7 +6242,7 @@
                 <w:sz w:val="18"/>
                 <w:szCs w:val="18"/>
               </w:rPr>
-              <w:t xml:space="preserve">Performance with confidence/uncertainty intervals; key subgroups; plots</w:t>
+              <w:t xml:space="preserve">Report model performance estimates with confidence intervals, including for any key subgroups (e.g., sociodemographic). Consider plots to aid presentation.</w:t>
             </w:r>
           </w:p>
         </w:tc>
@@ -6373,7 +6373,7 @@
                 <w:sz w:val="18"/>
                 <w:szCs w:val="18"/>
               </w:rPr>
-              <w:t xml:space="preserve">Heterogeneity in performance across clusters</w:t>
+              <w:t xml:space="preserve">If examined, report results of any heterogeneity in model performance across clusters. See TRIPOD Cluster for additional details.</w:t>
             </w:r>
           </w:p>
         </w:tc>
@@ -6504,7 +6504,7 @@
                 <w:sz w:val="18"/>
                 <w:szCs w:val="18"/>
               </w:rPr>
-              <w:t xml:space="preserve">Results of model updating</w:t>
+              <w:t xml:space="preserve">Report the results from any model updating, including the updated model and subsequent performance</w:t>
             </w:r>
           </w:p>
         </w:tc>
@@ -6671,7 +6671,7 @@
                 <w:sz w:val="18"/>
                 <w:szCs w:val="18"/>
               </w:rPr>
-              <w:t xml:space="preserve">Interpretation incl. fairness; vs objectives and prior work</w:t>
+              <w:t xml:space="preserve">Give an overall interpretation of the main results, including issues of fairness in the context of the objectives and previous studies</w:t>
             </w:r>
           </w:p>
         </w:tc>
@@ -6802,7 +6802,7 @@
                 <w:sz w:val="18"/>
                 <w:szCs w:val="18"/>
               </w:rPr>
-              <w:t xml:space="preserve">Limitations incl. non-representative sample, size, overfitting, missing data</w:t>
+              <w:t xml:space="preserve">Discuss any limitations of the study (such as a non-representative sample, sample size, overfitting, missing data) and their effects on any biases, statistical uncertainty, and generalizability</w:t>
             </w:r>
           </w:p>
         </w:tc>
@@ -6933,7 +6933,7 @@
                 <w:sz w:val="18"/>
                 <w:szCs w:val="18"/>
               </w:rPr>
-              <w:t xml:space="preserve">How poor/unavailable input data are handled at implementation</w:t>
+              <w:t xml:space="preserve">Describe how poor quality or unavailable input data (e.g., predictor values) should be assessed and handled when implementing the prediction model</w:t>
             </w:r>
           </w:p>
         </w:tc>
@@ -7064,7 +7064,7 @@
                 <w:sz w:val="18"/>
                 <w:szCs w:val="18"/>
               </w:rPr>
-              <w:t xml:space="preserve">User interaction and expertise required</w:t>
+              <w:t xml:space="preserve">Specify whether users will be required to interact in the handling of the input data or use of the model, and what level of expertise is required of users</w:t>
             </w:r>
           </w:p>
         </w:tc>
@@ -7130,6 +7130,134 @@
             </w:r>
             <w:r>
               <w:t xml:space="preserve">p. 26–27, lines 556–561</w:t>
+            </w:r>
+          </w:p>
+        </w:tc>
+      </w:tr>
+      <w:tr>
+        <w:tc>
+          <w:tcPr>
+            <w:tcW w:type="pct" w:w="6%"/>
+            <w:tcBorders>
+              <w:top w:val="single" w:color="BBBBBB" w:sz="4"/>
+              <w:left w:val="single" w:color="BBBBBB" w:sz="4"/>
+              <w:bottom w:val="single" w:color="BBBBBB" w:sz="4"/>
+              <w:right w:val="single" w:color="BBBBBB" w:sz="4"/>
+            </w:tcBorders>
+            <w:tcMar>
+              <w:top w:type="dxa" w:w="30"/>
+              <w:left w:type="dxa" w:w="70"/>
+              <w:bottom w:type="dxa" w:w="30"/>
+              <w:right w:type="dxa" w:w="70"/>
+            </w:tcMar>
+          </w:tcPr>
+          <w:p>
+            <w:pPr>
+              <w:spacing w:line="230"/>
+              <w:jc w:val="center"/>
+            </w:pPr>
+            <w:r>
+              <w:rPr>
+                <w:rFonts w:ascii="Times New Roman" w:cs="Times New Roman" w:eastAsia="Times New Roman" w:hAnsi="Times New Roman"/>
+                <w:b/>
+                <w:bCs/>
+                <w:sz w:val="18"/>
+                <w:szCs w:val="18"/>
+              </w:rPr>
+              <w:t xml:space="preserve">27c</w:t>
+            </w:r>
+          </w:p>
+        </w:tc>
+        <w:tc>
+          <w:tcPr>
+            <w:tcW w:type="pct" w:w="52%"/>
+            <w:tcBorders>
+              <w:top w:val="single" w:color="BBBBBB" w:sz="4"/>
+              <w:left w:val="single" w:color="BBBBBB" w:sz="4"/>
+              <w:bottom w:val="single" w:color="BBBBBB" w:sz="4"/>
+              <w:right w:val="single" w:color="BBBBBB" w:sz="4"/>
+            </w:tcBorders>
+            <w:tcMar>
+              <w:top w:type="dxa" w:w="30"/>
+              <w:left w:type="dxa" w:w="70"/>
+              <w:bottom w:type="dxa" w:w="30"/>
+              <w:right w:type="dxa" w:w="70"/>
+            </w:tcMar>
+          </w:tcPr>
+          <w:p>
+            <w:pPr>
+              <w:spacing w:line="230"/>
+              <w:jc w:val="left"/>
+            </w:pPr>
+            <w:r>
+              <w:rPr>
+                <w:rFonts w:ascii="Times New Roman" w:cs="Times New Roman" w:eastAsia="Times New Roman" w:hAnsi="Times New Roman"/>
+                <w:sz w:val="18"/>
+                <w:szCs w:val="18"/>
+              </w:rPr>
+              <w:t xml:space="preserve">Discuss any next steps for future research, with a specific view to applicability and generalizability of the model</w:t>
+            </w:r>
+          </w:p>
+        </w:tc>
+        <w:tc>
+          <w:tcPr>
+            <w:tcW w:type="pct" w:w="34%"/>
+            <w:tcBorders>
+              <w:top w:val="single" w:color="BBBBBB" w:sz="4"/>
+              <w:left w:val="single" w:color="BBBBBB" w:sz="4"/>
+              <w:bottom w:val="single" w:color="BBBBBB" w:sz="4"/>
+              <w:right w:val="single" w:color="BBBBBB" w:sz="4"/>
+            </w:tcBorders>
+            <w:tcMar>
+              <w:top w:type="dxa" w:w="30"/>
+              <w:left w:type="dxa" w:w="70"/>
+              <w:bottom w:type="dxa" w:w="30"/>
+              <w:right w:type="dxa" w:w="70"/>
+            </w:tcMar>
+          </w:tcPr>
+          <w:p>
+            <w:pPr>
+              <w:spacing w:line="230"/>
+              <w:jc w:val="left"/>
+            </w:pPr>
+            <w:r>
+              <w:rPr>
+                <w:rFonts w:ascii="Times New Roman" w:cs="Times New Roman" w:eastAsia="Times New Roman" w:hAnsi="Times New Roman"/>
+                <w:sz w:val="18"/>
+                <w:szCs w:val="18"/>
+              </w:rPr>
+              <w:t xml:space="preserve">Discussion: Toward scalable screening (digital or partially automated delivery); Limitations (external validation in larger, more representative cohorts; separate development required for multilingual children); Conclusion</w:t>
+            </w:r>
+          </w:p>
+        </w:tc>
+        <w:tc>
+          <w:tcPr>
+            <w:tcW w:type="pct" w:w="8%"/>
+            <w:tcBorders>
+              <w:top w:val="single" w:color="BBBBBB" w:sz="4"/>
+              <w:left w:val="single" w:color="BBBBBB" w:sz="4"/>
+              <w:bottom w:val="single" w:color="BBBBBB" w:sz="4"/>
+              <w:right w:val="single" w:color="BBBBBB" w:sz="4"/>
+            </w:tcBorders>
+            <w:tcMar>
+              <w:top w:type="dxa" w:w="30"/>
+              <w:left w:type="dxa" w:w="70"/>
+              <w:bottom w:type="dxa" w:w="30"/>
+              <w:right w:type="dxa" w:w="70"/>
+            </w:tcMar>
+          </w:tcPr>
+          <w:p>
+            <w:pPr>
+              <w:spacing w:line="230"/>
+              <w:jc w:val="left"/>
+            </w:pPr>
+            <w:r>
+              <w:rPr>
+                <w:rFonts w:ascii="Times New Roman" w:cs="Times New Roman" w:eastAsia="Times New Roman" w:hAnsi="Times New Roman"/>
+                <w:sz w:val="18"/>
+                <w:szCs w:val="18"/>
+              </w:rPr>
+              <w:t xml:space="preserve">p. 26–27, lines 561–563; p. 27, lines 570–574; p. 28–29, lines 592–594, 602–604</w:t>
             </w:r>
           </w:p>
         </w:tc>

</xml_diff>